<commit_message>
docs: sync updated confirmation docx
</commit_message>
<xml_diff>
--- a/MST_Stripe_Payment_Metadata_and_Backend_Storage_Confirmation.docx
+++ b/MST_Stripe_Payment_Metadata_and_Backend_Storage_Confirmation.docx
@@ -138,7 +138,23 @@
                 <w:color w:val="0F172A"/>
                 <w:sz w:val="17"/>
               </w:rPr>
-              <w:t xml:space="preserve"> Client Project Lead &amp; MST Management Team</w:t>
+              <w:t xml:space="preserve"> </w:t>
+            </w:r>
+            <w:r>
+              <w:rPr>
+                <w:rFonts w:ascii="Calibri" w:hAnsi="Calibri"/>
+                <w:color w:val="0F172A"/>
+                <w:sz w:val="17"/>
+              </w:rPr>
+              <w:t>Wendy</w:t>
+            </w:r>
+            <w:r>
+              <w:rPr>
+                <w:rFonts w:ascii="Calibri" w:hAnsi="Calibri"/>
+                <w:color w:val="0F172A"/>
+                <w:sz w:val="17"/>
+              </w:rPr>
+              <w:t xml:space="preserve"> Project Lead &amp; MST Management Team</w:t>
             </w:r>
           </w:p>
         </w:tc>

</xml_diff>